<commit_message>
patron Abstract Factory, .doc listo y codigo
</commit_message>
<xml_diff>
--- a/Patrones/ACTIVIDAD_S5.docx
+++ b/Patrones/ACTIVIDAD_S5.docx
@@ -13,25 +13,7 @@
         <w:rPr>
           <w:lang w:val="es-CO"/>
         </w:rPr>
-        <w:t>ACTIVIDAD S</w:t>
-      </w:r>
-      <w:r>
-        <w:rPr>
-          <w:lang w:val="es-CO"/>
-        </w:rPr>
-        <w:t>5</w:t>
-      </w:r>
-      <w:r>
-        <w:rPr>
-          <w:lang w:val="es-CO"/>
-        </w:rPr>
-        <w:t xml:space="preserve"> – </w:t>
-      </w:r>
-      <w:r>
-        <w:rPr>
-          <w:lang w:val="es-CO"/>
-        </w:rPr>
-        <w:t>Patron Abstract Factory</w:t>
+        <w:t>ACTIVIDAD S5 – Patron Abstract Factory</w:t>
       </w:r>
     </w:p>
     <w:p>
@@ -375,47 +357,27 @@
         <w:rPr>
           <w:lang w:val="es-CO"/>
         </w:rPr>
-        <w:t xml:space="preserve">Fecha: </w:t>
-      </w:r>
-      <w:r>
-        <w:rPr>
-          <w:lang w:val="es-CO"/>
-        </w:rPr>
-        <w:t>08</w:t>
-      </w:r>
-      <w:r>
-        <w:rPr>
-          <w:lang w:val="es-CO"/>
-        </w:rPr>
-        <w:t>/0</w:t>
-      </w:r>
-      <w:r>
-        <w:rPr>
-          <w:lang w:val="es-CO"/>
-        </w:rPr>
-        <w:t>3</w:t>
-      </w:r>
-      <w:r>
-        <w:rPr>
-          <w:lang w:val="es-CO"/>
-        </w:rPr>
-        <w:t>/2026</w:t>
-      </w:r>
-    </w:p>
-    <w:p>
-      <w:pPr>
-        <w:jc w:val="both"/>
-        <w:rPr>
-          <w:lang w:val="es-CO"/>
-        </w:rPr>
-      </w:pPr>
-      <w:r>
-        <w:rPr>
+        <w:t>Fecha: 08/03/2026</w:t>
+      </w:r>
+    </w:p>
+    <w:p>
+      <w:pPr>
+        <w:jc w:val="both"/>
+        <w:rPr>
+          <w:b/>
+          <w:lang w:val="es-CO"/>
+        </w:rPr>
+      </w:pPr>
+      <w:proofErr w:type="gramStart"/>
+      <w:r>
+        <w:rPr>
+          <w:b/>
           <w:lang w:val="es-CO"/>
         </w:rPr>
         <w:lastRenderedPageBreak/>
         <w:t>Qué es Abstract Factory?</w:t>
       </w:r>
+      <w:proofErr w:type="gramEnd"/>
     </w:p>
     <w:p>
       <w:pPr>
@@ -449,410 +411,133 @@
       <w:pPr>
         <w:jc w:val="both"/>
         <w:rPr>
+          <w:lang w:val="es-CO"/>
+        </w:rPr>
+      </w:pPr>
+    </w:p>
+    <w:p>
+      <w:pPr>
+        <w:jc w:val="both"/>
+        <w:rPr>
           <w:b/>
-          <w:bCs/>
-          <w:lang w:val="es-CO"/>
-        </w:rPr>
-      </w:pPr>
-    </w:p>
-    <w:p>
-      <w:pPr>
-        <w:jc w:val="both"/>
+          <w:lang w:val="es-CO"/>
+        </w:rPr>
+      </w:pPr>
+      <w:r>
         <w:rPr>
           <w:b/>
-          <w:bCs/>
-          <w:lang w:val="es-CO"/>
-        </w:rPr>
-      </w:pPr>
-      <w:r>
+          <w:lang w:val="es-CO"/>
+        </w:rPr>
+        <w:t>Uso:</w:t>
+      </w:r>
+    </w:p>
+    <w:p>
+      <w:pPr>
+        <w:jc w:val="both"/>
+        <w:rPr>
+          <w:lang w:val="es-CO"/>
+        </w:rPr>
+      </w:pPr>
+      <w:r>
+        <w:rPr>
+          <w:lang w:val="es-CO"/>
+        </w:rPr>
+        <w:t>Usé Abstract Factory para crear familias de objetos relacionados dentro del sistema de producción sin depender de sus clases concretas. Esto permite garantizar que los componentes creados sean compatibles entre sí.</w:t>
+      </w:r>
+    </w:p>
+    <w:p>
+      <w:pPr>
+        <w:jc w:val="both"/>
+        <w:rPr>
+          <w:lang w:val="es-CO"/>
+        </w:rPr>
+      </w:pPr>
+    </w:p>
+    <w:p>
+      <w:pPr>
+        <w:jc w:val="both"/>
         <w:rPr>
           <w:b/>
-          <w:bCs/>
-          <w:lang w:val="es-CO"/>
-        </w:rPr>
-        <w:t xml:space="preserve">Ejemplo </w:t>
-      </w:r>
+          <w:lang w:val="es-CO"/>
+        </w:rPr>
+      </w:pPr>
       <w:r>
         <w:rPr>
           <w:b/>
-          <w:bCs/>
-          <w:lang w:val="es-CO"/>
-        </w:rPr>
-        <w:t>mi proyecto</w:t>
-      </w:r>
-      <w:r>
+          <w:lang w:val="es-CO"/>
+        </w:rPr>
+        <w:t>¿Qué problema resuelve?</w:t>
+      </w:r>
+    </w:p>
+    <w:p>
+      <w:pPr>
+        <w:jc w:val="both"/>
+        <w:rPr>
+          <w:lang w:val="es-CO"/>
+        </w:rPr>
+      </w:pPr>
+      <w:r>
+        <w:rPr>
+          <w:lang w:val="es-CO"/>
+        </w:rPr>
+        <w:t>Permite cambiar completamente una familia de objetos sin modificar el código cliente.</w:t>
+      </w:r>
+    </w:p>
+    <w:p>
+      <w:pPr>
+        <w:jc w:val="both"/>
+        <w:rPr>
+          <w:lang w:val="es-CO"/>
+        </w:rPr>
+      </w:pPr>
+    </w:p>
+    <w:p>
+      <w:pPr>
+        <w:jc w:val="both"/>
         <w:rPr>
           <w:b/>
-          <w:bCs/>
-          <w:lang w:val="es-CO"/>
-        </w:rPr>
-        <w:t xml:space="preserve"> MES:</w:t>
-      </w:r>
-    </w:p>
-    <w:p>
-      <w:pPr>
-        <w:jc w:val="both"/>
-        <w:rPr>
-          <w:lang w:val="es-CO"/>
-        </w:rPr>
-      </w:pPr>
-      <w:r>
-        <w:rPr>
-          <w:lang w:val="es-CO"/>
-        </w:rPr>
-        <w:t>Una línea de producción puede usar:</w:t>
-      </w:r>
-    </w:p>
-    <w:p>
-      <w:pPr>
-        <w:pStyle w:val="Prrafodelista"/>
-        <w:numPr>
-          <w:ilvl w:val="0"/>
-          <w:numId w:val="1"/>
-        </w:numPr>
-        <w:jc w:val="both"/>
-        <w:rPr>
-          <w:lang w:val="es-CO"/>
-        </w:rPr>
-      </w:pPr>
-      <w:r>
-        <w:rPr>
-          <w:lang w:val="es-CO"/>
-        </w:rPr>
-        <w:t>Máquinas CNC</w:t>
-      </w:r>
-    </w:p>
-    <w:p>
-      <w:pPr>
-        <w:pStyle w:val="Prrafodelista"/>
-        <w:numPr>
-          <w:ilvl w:val="0"/>
-          <w:numId w:val="1"/>
-        </w:numPr>
-        <w:jc w:val="both"/>
-        <w:rPr>
-          <w:lang w:val="es-CO"/>
-        </w:rPr>
-      </w:pPr>
-      <w:r>
-        <w:rPr>
-          <w:lang w:val="es-CO"/>
-        </w:rPr>
-        <w:t>Robots</w:t>
-      </w:r>
-    </w:p>
-    <w:p>
-      <w:pPr>
-        <w:pStyle w:val="Prrafodelista"/>
-        <w:numPr>
-          <w:ilvl w:val="0"/>
-          <w:numId w:val="1"/>
-        </w:numPr>
-        <w:jc w:val="both"/>
-        <w:rPr>
-          <w:lang w:val="es-CO"/>
-        </w:rPr>
-      </w:pPr>
-      <w:r>
-        <w:rPr>
-          <w:lang w:val="es-CO"/>
-        </w:rPr>
-        <w:t>Sensores</w:t>
-      </w:r>
-    </w:p>
-    <w:p>
-      <w:pPr>
-        <w:jc w:val="both"/>
-        <w:rPr>
-          <w:lang w:val="es-CO"/>
-        </w:rPr>
-      </w:pPr>
-      <w:r>
-        <w:rPr>
-          <w:lang w:val="es-CO"/>
-        </w:rPr>
-        <w:t>Pero dependiendo de la línea puede ser:</w:t>
-      </w:r>
-    </w:p>
-    <w:p>
-      <w:pPr>
-        <w:pStyle w:val="Prrafodelista"/>
-        <w:numPr>
-          <w:ilvl w:val="0"/>
-          <w:numId w:val="2"/>
-        </w:numPr>
-        <w:jc w:val="both"/>
-        <w:rPr>
-          <w:lang w:val="es-CO"/>
-        </w:rPr>
-      </w:pPr>
-      <w:r>
-        <w:rPr>
-          <w:lang w:val="es-CO"/>
-        </w:rPr>
-        <w:t>Línea automática</w:t>
-      </w:r>
-    </w:p>
-    <w:p>
-      <w:pPr>
-        <w:pStyle w:val="Prrafodelista"/>
-        <w:numPr>
-          <w:ilvl w:val="0"/>
-          <w:numId w:val="2"/>
-        </w:numPr>
-        <w:jc w:val="both"/>
-        <w:rPr>
-          <w:lang w:val="es-CO"/>
-        </w:rPr>
-      </w:pPr>
-      <w:r>
-        <w:rPr>
-          <w:lang w:val="es-CO"/>
-        </w:rPr>
-        <w:t>Línea manual</w:t>
-      </w:r>
-    </w:p>
-    <w:p>
-      <w:pPr>
-        <w:pStyle w:val="Prrafodelista"/>
-        <w:numPr>
-          <w:ilvl w:val="0"/>
-          <w:numId w:val="2"/>
-        </w:numPr>
-        <w:jc w:val="both"/>
-        <w:rPr>
-          <w:lang w:val="es-CO"/>
-        </w:rPr>
-      </w:pPr>
-      <w:r>
-        <w:rPr>
-          <w:lang w:val="es-CO"/>
-        </w:rPr>
-        <w:t>Cada línea usa familias completas de componentes compatibles.</w:t>
-      </w:r>
-    </w:p>
-    <w:p>
-      <w:pPr>
-        <w:jc w:val="both"/>
-        <w:rPr>
-          <w:lang w:val="es-CO"/>
-        </w:rPr>
-      </w:pPr>
-    </w:p>
-    <w:p>
-      <w:pPr>
-        <w:jc w:val="both"/>
+          <w:lang w:val="es-CO"/>
+        </w:rPr>
+      </w:pPr>
+      <w:r>
         <w:rPr>
           <w:b/>
-          <w:bCs/>
-          <w:lang w:val="es-CO"/>
-        </w:rPr>
-      </w:pPr>
-      <w:r>
-        <w:rPr>
-          <w:b/>
-          <w:bCs/>
-          <w:lang w:val="es-CO"/>
-        </w:rPr>
-        <w:t>Estructura del patrón Abstract Factory</w:t>
-      </w:r>
-    </w:p>
-    <w:p>
-      <w:pPr>
-        <w:numPr>
-          <w:ilvl w:val="0"/>
-          <w:numId w:val="3"/>
-        </w:numPr>
-        <w:jc w:val="both"/>
-        <w:rPr>
-          <w:lang w:val="es-CO"/>
-        </w:rPr>
-      </w:pPr>
-      <w:r>
-        <w:rPr>
-          <w:b/>
-          <w:bCs/>
-          <w:lang w:val="es-CO"/>
-        </w:rPr>
-        <w:t>AbstractFactory:</w:t>
-      </w:r>
-      <w:r>
-        <w:rPr>
-          <w:lang w:val="es-CO"/>
-        </w:rPr>
-        <w:t xml:space="preserve"> ProductionLineFactory</w:t>
-      </w:r>
-    </w:p>
-    <w:p>
-      <w:pPr>
-        <w:numPr>
-          <w:ilvl w:val="0"/>
-          <w:numId w:val="3"/>
-        </w:numPr>
-        <w:jc w:val="both"/>
-        <w:rPr>
-          <w:lang w:val="es-CO"/>
-        </w:rPr>
-      </w:pPr>
-      <w:r>
-        <w:rPr>
-          <w:b/>
-          <w:bCs/>
-          <w:lang w:val="es-CO"/>
-        </w:rPr>
-        <w:t>ConcreteFactory:</w:t>
-      </w:r>
-      <w:r>
-        <w:rPr>
-          <w:lang w:val="es-CO"/>
-        </w:rPr>
-        <w:t xml:space="preserve"> AutomaticLineFactory, ManualLineFactory</w:t>
-      </w:r>
-    </w:p>
-    <w:p>
-      <w:pPr>
-        <w:numPr>
-          <w:ilvl w:val="0"/>
-          <w:numId w:val="3"/>
-        </w:numPr>
-        <w:jc w:val="both"/>
-        <w:rPr>
-          <w:lang w:val="es-CO"/>
-        </w:rPr>
-      </w:pPr>
-      <w:r>
-        <w:rPr>
-          <w:b/>
-          <w:bCs/>
-          <w:lang w:val="es-CO"/>
-        </w:rPr>
-        <w:t>AbstractProducts:</w:t>
-      </w:r>
-    </w:p>
-    <w:p>
-      <w:pPr>
-        <w:numPr>
-          <w:ilvl w:val="1"/>
-          <w:numId w:val="3"/>
-        </w:numPr>
-        <w:jc w:val="both"/>
-        <w:rPr>
-          <w:lang w:val="es-CO"/>
-        </w:rPr>
-      </w:pPr>
-      <w:r>
-        <w:rPr>
-          <w:lang w:val="es-CO"/>
-        </w:rPr>
-        <w:t>Machine</w:t>
-      </w:r>
-    </w:p>
-    <w:p>
-      <w:pPr>
-        <w:numPr>
-          <w:ilvl w:val="1"/>
-          <w:numId w:val="3"/>
-        </w:numPr>
-        <w:jc w:val="both"/>
-        <w:rPr>
-          <w:lang w:val="es-CO"/>
-        </w:rPr>
-      </w:pPr>
-      <w:r>
-        <w:rPr>
-          <w:lang w:val="es-CO"/>
-        </w:rPr>
-        <w:t>Robot</w:t>
-      </w:r>
-    </w:p>
-    <w:p>
-      <w:pPr>
-        <w:numPr>
-          <w:ilvl w:val="0"/>
-          <w:numId w:val="3"/>
-        </w:numPr>
-        <w:jc w:val="both"/>
-        <w:rPr>
-          <w:lang w:val="es-CO"/>
-        </w:rPr>
-      </w:pPr>
-      <w:r>
-        <w:rPr>
-          <w:b/>
-          <w:bCs/>
-          <w:lang w:val="es-CO"/>
-        </w:rPr>
-        <w:t>ConcreteProducts:</w:t>
-      </w:r>
-    </w:p>
-    <w:p>
-      <w:pPr>
-        <w:numPr>
-          <w:ilvl w:val="1"/>
-          <w:numId w:val="3"/>
-        </w:numPr>
-        <w:jc w:val="both"/>
-        <w:rPr>
-          <w:lang w:val="es-CO"/>
-        </w:rPr>
-      </w:pPr>
-      <w:r>
-        <w:rPr>
-          <w:lang w:val="es-CO"/>
-        </w:rPr>
-        <w:t>CNCMachine, ManualMachine</w:t>
-      </w:r>
-    </w:p>
-    <w:p>
-      <w:pPr>
-        <w:numPr>
-          <w:ilvl w:val="1"/>
-          <w:numId w:val="3"/>
-        </w:numPr>
-        <w:jc w:val="both"/>
-        <w:rPr>
-          <w:lang w:val="es-CO"/>
-        </w:rPr>
-      </w:pPr>
-      <w:r>
-        <w:rPr>
-          <w:lang w:val="es-CO"/>
-        </w:rPr>
-        <w:t>IndustrialRobot, HumanOperator</w:t>
-      </w:r>
-    </w:p>
-    <w:p>
-      <w:pPr>
-        <w:jc w:val="both"/>
-        <w:rPr>
-          <w:lang w:val="es-CO"/>
-        </w:rPr>
-      </w:pPr>
-    </w:p>
-    <w:p>
-      <w:pPr>
-        <w:jc w:val="both"/>
-        <w:rPr>
-          <w:lang w:val="es-CO"/>
-        </w:rPr>
-      </w:pPr>
-    </w:p>
-    <w:p>
-      <w:pPr>
-        <w:jc w:val="both"/>
-        <w:rPr>
-          <w:lang w:val="es-CO"/>
-        </w:rPr>
+          <w:lang w:val="es-CO"/>
+        </w:rPr>
+        <w:t xml:space="preserve">Diagrama UML </w:t>
+      </w:r>
+    </w:p>
+    <w:p>
+      <w:pPr>
+        <w:jc w:val="both"/>
+        <w:rPr>
+          <w:lang w:val="es-CO"/>
+        </w:rPr>
+      </w:pPr>
+    </w:p>
+    <w:p>
+      <w:pPr>
+        <w:jc w:val="both"/>
+        <w:rPr>
+          <w:lang w:val="es-CO"/>
+        </w:rPr>
+        <w:sectPr>
+          <w:type w:val="continuous"/>
+          <w:pgSz w:w="12240" w:h="15840"/>
+          <w:pgMar w:top="1440" w:right="1440" w:bottom="1440" w:left="1440" w:header="708" w:footer="708" w:gutter="0"/>
+          <w:cols w:space="708"/>
+          <w:docGrid w:linePitch="360"/>
+        </w:sectPr>
       </w:pPr>
       <w:r>
         <w:rPr>
           <w:lang w:val="es-CO"/>
         </w:rPr>
         <w:drawing>
-          <wp:inline distT="0" distB="0" distL="0" distR="0" wp14:anchorId="08E4474E" wp14:editId="34CFF9F1">
-            <wp:extent cx="2747010" cy="4191635"/>
-            <wp:effectExtent l="0" t="0" r="0" b="0"/>
-            <wp:docPr id="1" name="Imagen 1"/>
+          <wp:inline distT="0" distB="0" distL="0" distR="0" wp14:anchorId="041DA344" wp14:editId="404392FB">
+            <wp:extent cx="5943600" cy="3214370"/>
+            <wp:effectExtent l="0" t="0" r="0" b="5080"/>
+            <wp:docPr id="3" name="Imagen 3"/>
             <wp:cNvGraphicFramePr>
               <a:graphicFrameLocks xmlns:a="http://schemas.openxmlformats.org/drawingml/2006/main" noChangeAspect="1"/>
             </wp:cNvGraphicFramePr>
@@ -872,7 +557,7 @@
                   <pic:spPr>
                     <a:xfrm>
                       <a:off x="0" y="0"/>
-                      <a:ext cx="2747010" cy="4191635"/>
+                      <a:ext cx="5943600" cy="3214370"/>
                     </a:xfrm>
                     <a:prstGeom prst="rect">
                       <a:avLst/>
@@ -892,12 +577,485 @@
           <w:lang w:val="es-CO"/>
         </w:rPr>
       </w:pPr>
-      <w:r>
-        <w:rPr>
+    </w:p>
+    <w:p>
+      <w:pPr>
+        <w:jc w:val="both"/>
+        <w:rPr>
+          <w:lang w:val="es-CO"/>
+        </w:rPr>
+      </w:pPr>
+    </w:p>
+    <w:p>
+      <w:pPr>
+        <w:jc w:val="both"/>
+        <w:rPr>
+          <w:lang w:val="es-CO"/>
+        </w:rPr>
+      </w:pPr>
+    </w:p>
+    <w:p>
+      <w:pPr>
+        <w:jc w:val="both"/>
+        <w:rPr>
+          <w:lang w:val="es-CO"/>
+        </w:rPr>
+      </w:pPr>
+    </w:p>
+    <w:p>
+      <w:pPr>
+        <w:jc w:val="both"/>
+        <w:rPr>
+          <w:lang w:val="es-CO"/>
+        </w:rPr>
+      </w:pPr>
+    </w:p>
+    <w:p>
+      <w:pPr>
+        <w:jc w:val="both"/>
+        <w:rPr>
+          <w:lang w:val="es-CO"/>
+        </w:rPr>
+      </w:pPr>
+    </w:p>
+    <w:p>
+      <w:pPr>
+        <w:jc w:val="both"/>
+        <w:rPr>
+          <w:b/>
+          <w:bCs/>
+          <w:lang w:val="es-CO"/>
+        </w:rPr>
+      </w:pPr>
+      <w:r>
+        <w:rPr>
+          <w:b/>
+          <w:bCs/>
+          <w:lang w:val="es-CO"/>
+        </w:rPr>
+        <w:lastRenderedPageBreak/>
+        <w:t>Ejemplo mi proyecto MES:</w:t>
+      </w:r>
+    </w:p>
+    <w:p>
+      <w:pPr>
+        <w:jc w:val="both"/>
+        <w:rPr>
+          <w:lang w:val="es-CO"/>
+        </w:rPr>
+      </w:pPr>
+      <w:r>
+        <w:rPr>
+          <w:lang w:val="es-CO"/>
+        </w:rPr>
+        <w:t>Una línea de producción puede usar:</w:t>
+      </w:r>
+    </w:p>
+    <w:p>
+      <w:pPr>
+        <w:pStyle w:val="Prrafodelista"/>
+        <w:numPr>
+          <w:ilvl w:val="0"/>
+          <w:numId w:val="1"/>
+        </w:numPr>
+        <w:jc w:val="both"/>
+        <w:rPr>
+          <w:lang w:val="es-CO"/>
+        </w:rPr>
+      </w:pPr>
+      <w:r>
+        <w:rPr>
+          <w:lang w:val="es-CO"/>
+        </w:rPr>
+        <w:t>Máquinas CNC</w:t>
+      </w:r>
+    </w:p>
+    <w:p>
+      <w:pPr>
+        <w:pStyle w:val="Prrafodelista"/>
+        <w:numPr>
+          <w:ilvl w:val="0"/>
+          <w:numId w:val="1"/>
+        </w:numPr>
+        <w:jc w:val="both"/>
+        <w:rPr>
+          <w:lang w:val="es-CO"/>
+        </w:rPr>
+      </w:pPr>
+      <w:r>
+        <w:rPr>
+          <w:lang w:val="es-CO"/>
+        </w:rPr>
+        <w:t>Robots</w:t>
+      </w:r>
+    </w:p>
+    <w:p>
+      <w:pPr>
+        <w:pStyle w:val="Prrafodelista"/>
+        <w:numPr>
+          <w:ilvl w:val="0"/>
+          <w:numId w:val="1"/>
+        </w:numPr>
+        <w:jc w:val="both"/>
+        <w:rPr>
+          <w:lang w:val="es-CO"/>
+        </w:rPr>
+      </w:pPr>
+      <w:r>
+        <w:rPr>
+          <w:lang w:val="es-CO"/>
+        </w:rPr>
+        <w:t>Sensores</w:t>
+      </w:r>
+    </w:p>
+    <w:p>
+      <w:pPr>
+        <w:jc w:val="both"/>
+        <w:rPr>
+          <w:lang w:val="es-CO"/>
+        </w:rPr>
+      </w:pPr>
+      <w:r>
+        <w:rPr>
+          <w:lang w:val="es-CO"/>
+        </w:rPr>
+        <w:t>Pero dependiendo de la línea puede ser:</w:t>
+      </w:r>
+    </w:p>
+    <w:p>
+      <w:pPr>
+        <w:pStyle w:val="Prrafodelista"/>
+        <w:numPr>
+          <w:ilvl w:val="0"/>
+          <w:numId w:val="2"/>
+        </w:numPr>
+        <w:jc w:val="both"/>
+        <w:rPr>
+          <w:lang w:val="es-CO"/>
+        </w:rPr>
+      </w:pPr>
+      <w:r>
+        <w:rPr>
+          <w:lang w:val="es-CO"/>
+        </w:rPr>
+        <w:t>Línea automática</w:t>
+      </w:r>
+    </w:p>
+    <w:p>
+      <w:pPr>
+        <w:pStyle w:val="Prrafodelista"/>
+        <w:numPr>
+          <w:ilvl w:val="0"/>
+          <w:numId w:val="2"/>
+        </w:numPr>
+        <w:jc w:val="both"/>
+        <w:rPr>
+          <w:lang w:val="es-CO"/>
+        </w:rPr>
+      </w:pPr>
+      <w:r>
+        <w:rPr>
+          <w:lang w:val="es-CO"/>
+        </w:rPr>
+        <w:t>Línea manual</w:t>
+      </w:r>
+    </w:p>
+    <w:p>
+      <w:pPr>
+        <w:pStyle w:val="Prrafodelista"/>
+        <w:numPr>
+          <w:ilvl w:val="0"/>
+          <w:numId w:val="2"/>
+        </w:numPr>
+        <w:jc w:val="both"/>
+        <w:rPr>
+          <w:lang w:val="es-CO"/>
+        </w:rPr>
+      </w:pPr>
+      <w:r>
+        <w:rPr>
+          <w:lang w:val="es-CO"/>
+        </w:rPr>
+        <w:t>Cada línea usa familias completas de componentes compatibles.</w:t>
+      </w:r>
+    </w:p>
+    <w:p>
+      <w:pPr>
+        <w:jc w:val="both"/>
+        <w:rPr>
+          <w:lang w:val="es-CO"/>
+        </w:rPr>
+      </w:pPr>
+    </w:p>
+    <w:p>
+      <w:pPr>
+        <w:jc w:val="both"/>
+        <w:rPr>
+          <w:b/>
+          <w:bCs/>
+          <w:lang w:val="es-CO"/>
+        </w:rPr>
+      </w:pPr>
+      <w:r>
+        <w:rPr>
+          <w:b/>
+          <w:bCs/>
+          <w:lang w:val="es-CO"/>
+        </w:rPr>
+        <w:t>Estructura del patrón Abstract Factory</w:t>
+      </w:r>
+    </w:p>
+    <w:p>
+      <w:pPr>
+        <w:numPr>
+          <w:ilvl w:val="0"/>
+          <w:numId w:val="3"/>
+        </w:numPr>
+        <w:jc w:val="both"/>
+        <w:rPr>
+          <w:lang w:val="es-CO"/>
+        </w:rPr>
+      </w:pPr>
+      <w:r>
+        <w:rPr>
+          <w:b/>
+          <w:bCs/>
+          <w:lang w:val="es-CO"/>
+        </w:rPr>
+        <w:t>AbstractFactory:</w:t>
+      </w:r>
+      <w:r>
+        <w:rPr>
+          <w:lang w:val="es-CO"/>
+        </w:rPr>
+        <w:t xml:space="preserve"> ProductionLineFactory</w:t>
+      </w:r>
+    </w:p>
+    <w:p>
+      <w:pPr>
+        <w:numPr>
+          <w:ilvl w:val="0"/>
+          <w:numId w:val="3"/>
+        </w:numPr>
+        <w:jc w:val="both"/>
+        <w:rPr>
+          <w:lang w:val="es-CO"/>
+        </w:rPr>
+      </w:pPr>
+      <w:r>
+        <w:rPr>
+          <w:b/>
+          <w:bCs/>
+          <w:lang w:val="es-CO"/>
+        </w:rPr>
+        <w:t>ConcreteFactory:</w:t>
+      </w:r>
+      <w:r>
+        <w:rPr>
+          <w:lang w:val="es-CO"/>
+        </w:rPr>
+        <w:t xml:space="preserve"> AutomaticLineFactory, ManualLineFactory</w:t>
+      </w:r>
+    </w:p>
+    <w:p>
+      <w:pPr>
+        <w:numPr>
+          <w:ilvl w:val="0"/>
+          <w:numId w:val="3"/>
+        </w:numPr>
+        <w:jc w:val="both"/>
+        <w:rPr>
+          <w:lang w:val="es-CO"/>
+        </w:rPr>
+      </w:pPr>
+      <w:r>
+        <w:rPr>
+          <w:b/>
+          <w:bCs/>
+          <w:lang w:val="es-CO"/>
+        </w:rPr>
+        <w:t>AbstractProducts:</w:t>
+      </w:r>
+    </w:p>
+    <w:p>
+      <w:pPr>
+        <w:numPr>
+          <w:ilvl w:val="1"/>
+          <w:numId w:val="3"/>
+        </w:numPr>
+        <w:jc w:val="both"/>
+        <w:rPr>
+          <w:lang w:val="es-CO"/>
+        </w:rPr>
+      </w:pPr>
+      <w:r>
+        <w:rPr>
+          <w:lang w:val="es-CO"/>
+        </w:rPr>
+        <w:t>Machine</w:t>
+      </w:r>
+    </w:p>
+    <w:p>
+      <w:pPr>
+        <w:numPr>
+          <w:ilvl w:val="1"/>
+          <w:numId w:val="3"/>
+        </w:numPr>
+        <w:jc w:val="both"/>
+        <w:rPr>
+          <w:lang w:val="es-CO"/>
+        </w:rPr>
+      </w:pPr>
+      <w:r>
+        <w:rPr>
+          <w:lang w:val="es-CO"/>
+        </w:rPr>
+        <w:t>Robot</w:t>
+      </w:r>
+    </w:p>
+    <w:p>
+      <w:pPr>
+        <w:numPr>
+          <w:ilvl w:val="0"/>
+          <w:numId w:val="3"/>
+        </w:numPr>
+        <w:jc w:val="both"/>
+        <w:rPr>
+          <w:lang w:val="es-CO"/>
+        </w:rPr>
+      </w:pPr>
+      <w:r>
+        <w:rPr>
+          <w:b/>
+          <w:bCs/>
+          <w:lang w:val="es-CO"/>
+        </w:rPr>
+        <w:t>ConcreteProducts:</w:t>
+      </w:r>
+    </w:p>
+    <w:p>
+      <w:pPr>
+        <w:numPr>
+          <w:ilvl w:val="1"/>
+          <w:numId w:val="3"/>
+        </w:numPr>
+        <w:jc w:val="both"/>
+        <w:rPr>
+          <w:lang w:val="es-CO"/>
+        </w:rPr>
+      </w:pPr>
+      <w:r>
+        <w:rPr>
+          <w:lang w:val="es-CO"/>
+        </w:rPr>
+        <w:t>CNCMachine, ManualMachine</w:t>
+      </w:r>
+    </w:p>
+    <w:p>
+      <w:pPr>
+        <w:numPr>
+          <w:ilvl w:val="1"/>
+          <w:numId w:val="3"/>
+        </w:numPr>
+        <w:jc w:val="both"/>
+        <w:rPr>
+          <w:lang w:val="es-CO"/>
+        </w:rPr>
+      </w:pPr>
+      <w:r>
+        <w:rPr>
+          <w:lang w:val="es-CO"/>
+        </w:rPr>
+        <w:t>IndustrialRobot, HumanOperator</w:t>
+      </w:r>
+    </w:p>
+    <w:p>
+      <w:pPr>
+        <w:jc w:val="both"/>
+        <w:rPr>
+          <w:lang w:val="es-CO"/>
+        </w:rPr>
+      </w:pPr>
+    </w:p>
+    <w:p>
+      <w:pPr>
+        <w:jc w:val="both"/>
+        <w:rPr>
+          <w:lang w:val="es-CO"/>
+        </w:rPr>
+      </w:pPr>
+    </w:p>
+    <w:p>
+      <w:pPr>
+        <w:jc w:val="both"/>
+        <w:rPr>
+          <w:noProof/>
+          <w:lang w:val="es-CO"/>
+        </w:rPr>
+      </w:pPr>
+    </w:p>
+    <w:p>
+      <w:pPr>
+        <w:jc w:val="both"/>
+        <w:rPr>
+          <w:lang w:val="es-CO"/>
+        </w:rPr>
+      </w:pPr>
+      <w:r>
+        <w:rPr>
+          <w:noProof/>
           <w:lang w:val="es-CO"/>
         </w:rPr>
         <w:drawing>
-          <wp:inline distT="0" distB="0" distL="0" distR="0" wp14:anchorId="6F37B30C" wp14:editId="07705C49">
+          <wp:inline distT="0" distB="0" distL="0" distR="0" wp14:anchorId="08E4474E" wp14:editId="6C0A791F">
+            <wp:extent cx="2747010" cy="3985895"/>
+            <wp:effectExtent l="0" t="0" r="0" b="0"/>
+            <wp:docPr id="1" name="Imagen 1"/>
+            <wp:cNvGraphicFramePr>
+              <a:graphicFrameLocks xmlns:a="http://schemas.openxmlformats.org/drawingml/2006/main" noChangeAspect="1"/>
+            </wp:cNvGraphicFramePr>
+            <a:graphic xmlns:a="http://schemas.openxmlformats.org/drawingml/2006/main">
+              <a:graphicData uri="http://schemas.openxmlformats.org/drawingml/2006/picture">
+                <pic:pic xmlns:pic="http://schemas.openxmlformats.org/drawingml/2006/picture">
+                  <pic:nvPicPr>
+                    <pic:cNvPr id="1" name=""/>
+                    <pic:cNvPicPr/>
+                  </pic:nvPicPr>
+                  <pic:blipFill rotWithShape="1">
+                    <a:blip r:embed="rId6"/>
+                    <a:srcRect t="4909"/>
+                    <a:stretch/>
+                  </pic:blipFill>
+                  <pic:spPr bwMode="auto">
+                    <a:xfrm>
+                      <a:off x="0" y="0"/>
+                      <a:ext cx="2747010" cy="3985895"/>
+                    </a:xfrm>
+                    <a:prstGeom prst="rect">
+                      <a:avLst/>
+                    </a:prstGeom>
+                    <a:ln>
+                      <a:noFill/>
+                    </a:ln>
+                    <a:extLst>
+                      <a:ext uri="{53640926-AAD7-44D8-BBD7-CCE9431645EC}">
+                        <a14:shadowObscured xmlns:a14="http://schemas.microsoft.com/office/drawing/2010/main"/>
+                      </a:ext>
+                    </a:extLst>
+                  </pic:spPr>
+                </pic:pic>
+              </a:graphicData>
+            </a:graphic>
+          </wp:inline>
+        </w:drawing>
+      </w:r>
+      <w:r>
+        <w:rPr>
+          <w:noProof/>
+          <w:lang w:val="es-CO"/>
+        </w:rPr>
+        <w:drawing>
+          <wp:inline distT="0" distB="0" distL="0" distR="0" wp14:anchorId="2375139C" wp14:editId="373748D1">
             <wp:extent cx="2747010" cy="3817620"/>
             <wp:effectExtent l="0" t="0" r="0" b="0"/>
             <wp:docPr id="2" name="Imagen 2"/>
@@ -912,7 +1070,7 @@
                     <pic:cNvPicPr/>
                   </pic:nvPicPr>
                   <pic:blipFill>
-                    <a:blip r:embed="rId6"/>
+                    <a:blip r:embed="rId7"/>
                     <a:stretch>
                       <a:fillRect/>
                     </a:stretch>
@@ -937,7 +1095,6 @@
       <w:pPr>
         <w:jc w:val="both"/>
         <w:rPr>
-          <w:b/>
           <w:lang w:val="es-CO"/>
         </w:rPr>
         <w:sectPr>
@@ -948,712 +1105,6 @@
           <w:docGrid w:linePitch="360"/>
         </w:sectPr>
       </w:pPr>
-    </w:p>
-    <w:p>
-      <w:pPr>
-        <w:jc w:val="both"/>
-        <w:rPr>
-          <w:b/>
-          <w:lang w:val="es-CO"/>
-        </w:rPr>
-      </w:pPr>
-      <w:r>
-        <w:rPr>
-          <w:b/>
-          <w:lang w:val="es-CO"/>
-        </w:rPr>
-        <w:lastRenderedPageBreak/>
-        <w:t>Uso:</w:t>
-      </w:r>
-    </w:p>
-    <w:p>
-      <w:pPr>
-        <w:jc w:val="both"/>
-        <w:rPr>
-          <w:lang w:val="es-CO"/>
-        </w:rPr>
-      </w:pPr>
-      <w:r>
-        <w:rPr>
-          <w:lang w:val="es-CO"/>
-        </w:rPr>
-        <w:t>Usé Abstract Factory para crear familias de objetos relacionados dentro del sistema de producción sin depender de sus clases concretas. Esto permite garantizar que los componentes creados sean compatibles entre sí.</w:t>
-      </w:r>
-    </w:p>
-    <w:p>
-      <w:pPr>
-        <w:jc w:val="both"/>
-        <w:rPr>
-          <w:lang w:val="es-CO"/>
-        </w:rPr>
-      </w:pPr>
-    </w:p>
-    <w:p>
-      <w:pPr>
-        <w:jc w:val="both"/>
-        <w:rPr>
-          <w:b/>
-          <w:lang w:val="es-CO"/>
-        </w:rPr>
-      </w:pPr>
-      <w:r>
-        <w:rPr>
-          <w:b/>
-          <w:lang w:val="es-CO"/>
-        </w:rPr>
-        <w:t>¿Qué problema resuelve?</w:t>
-      </w:r>
-    </w:p>
-    <w:p>
-      <w:pPr>
-        <w:jc w:val="both"/>
-        <w:rPr>
-          <w:lang w:val="es-CO"/>
-        </w:rPr>
-        <w:sectPr>
-          <w:type w:val="continuous"/>
-          <w:pgSz w:w="12240" w:h="15840"/>
-          <w:pgMar w:top="1440" w:right="1440" w:bottom="1440" w:left="1440" w:header="708" w:footer="708" w:gutter="0"/>
-          <w:cols w:space="708"/>
-          <w:docGrid w:linePitch="360"/>
-        </w:sectPr>
-      </w:pPr>
-      <w:r>
-        <w:rPr>
-          <w:lang w:val="es-CO"/>
-        </w:rPr>
-        <w:t>Permite cambiar completamente una familia de objetos sin modificar el código cliente</w:t>
-      </w:r>
-      <w:r>
-        <w:rPr>
-          <w:lang w:val="es-CO"/>
-        </w:rPr>
-        <w:t>.</w:t>
-      </w:r>
-    </w:p>
-    <w:p>
-      <w:pPr>
-        <w:jc w:val="both"/>
-        <w:rPr>
-          <w:lang w:val="es-CO"/>
-        </w:rPr>
-      </w:pPr>
-      <w:r>
-        <w:rPr>
-          <w:lang w:val="es-CO"/>
-        </w:rPr>
-        <w:t>.</w:t>
-      </w:r>
-    </w:p>
-    <w:p>
-      <w:pPr>
-        <w:jc w:val="both"/>
-        <w:rPr>
-          <w:lang w:val="es-CO"/>
-        </w:rPr>
-      </w:pPr>
-    </w:p>
-    <w:p>
-      <w:pPr>
-        <w:jc w:val="both"/>
-        <w:rPr>
-          <w:lang w:val="es-CO"/>
-        </w:rPr>
-      </w:pPr>
-    </w:p>
-    <w:p>
-      <w:pPr>
-        <w:jc w:val="both"/>
-        <w:rPr>
-          <w:lang w:val="es-CO"/>
-        </w:rPr>
-      </w:pPr>
-    </w:p>
-    <w:p>
-      <w:pPr>
-        <w:jc w:val="both"/>
-        <w:rPr>
-          <w:lang w:val="es-CO"/>
-        </w:rPr>
-      </w:pPr>
-    </w:p>
-    <w:p>
-      <w:pPr>
-        <w:jc w:val="both"/>
-        <w:rPr>
-          <w:lang w:val="es-CO"/>
-        </w:rPr>
-      </w:pPr>
-    </w:p>
-    <w:p>
-      <w:pPr>
-        <w:jc w:val="both"/>
-        <w:rPr>
-          <w:lang w:val="es-CO"/>
-        </w:rPr>
-      </w:pPr>
-    </w:p>
-    <w:p>
-      <w:pPr>
-        <w:jc w:val="both"/>
-        <w:rPr>
-          <w:lang w:val="es-CO"/>
-        </w:rPr>
-      </w:pPr>
-    </w:p>
-    <w:p>
-      <w:pPr>
-        <w:jc w:val="both"/>
-        <w:rPr>
-          <w:lang w:val="es-CO"/>
-        </w:rPr>
-      </w:pPr>
-    </w:p>
-    <w:p>
-      <w:pPr>
-        <w:jc w:val="both"/>
-        <w:rPr>
-          <w:lang w:val="es-CO"/>
-        </w:rPr>
-      </w:pPr>
-    </w:p>
-    <w:p>
-      <w:pPr>
-        <w:jc w:val="both"/>
-        <w:rPr>
-          <w:lang w:val="es-CO"/>
-        </w:rPr>
-      </w:pPr>
-    </w:p>
-    <w:p>
-      <w:pPr>
-        <w:jc w:val="both"/>
-        <w:rPr>
-          <w:lang w:val="es-CO"/>
-        </w:rPr>
-      </w:pPr>
-    </w:p>
-    <w:p>
-      <w:pPr>
-        <w:jc w:val="both"/>
-        <w:rPr>
-          <w:lang w:val="es-CO"/>
-        </w:rPr>
-      </w:pPr>
-    </w:p>
-    <w:p>
-      <w:pPr>
-        <w:jc w:val="both"/>
-        <w:rPr>
-          <w:lang w:val="es-CO"/>
-        </w:rPr>
-      </w:pPr>
-    </w:p>
-    <w:p>
-      <w:pPr>
-        <w:jc w:val="both"/>
-        <w:rPr>
-          <w:lang w:val="es-CO"/>
-        </w:rPr>
-      </w:pPr>
-    </w:p>
-    <w:p>
-      <w:pPr>
-        <w:jc w:val="both"/>
-        <w:rPr>
-          <w:lang w:val="es-CO"/>
-        </w:rPr>
-      </w:pPr>
-    </w:p>
-    <w:p>
-      <w:pPr>
-        <w:jc w:val="both"/>
-        <w:rPr>
-          <w:lang w:val="es-CO"/>
-        </w:rPr>
-      </w:pPr>
-    </w:p>
-    <w:p>
-      <w:pPr>
-        <w:jc w:val="both"/>
-        <w:rPr>
-          <w:lang w:val="es-CO"/>
-        </w:rPr>
-      </w:pPr>
-    </w:p>
-    <w:p>
-      <w:pPr>
-        <w:jc w:val="both"/>
-        <w:rPr>
-          <w:lang w:val="es-CO"/>
-        </w:rPr>
-      </w:pPr>
-    </w:p>
-    <w:p>
-      <w:pPr>
-        <w:jc w:val="both"/>
-        <w:rPr>
-          <w:lang w:val="es-CO"/>
-        </w:rPr>
-      </w:pPr>
-    </w:p>
-    <w:p>
-      <w:pPr>
-        <w:jc w:val="both"/>
-        <w:rPr>
-          <w:lang w:val="es-CO"/>
-        </w:rPr>
-      </w:pPr>
-    </w:p>
-    <w:p>
-      <w:pPr>
-        <w:jc w:val="both"/>
-        <w:rPr>
-          <w:lang w:val="es-CO"/>
-        </w:rPr>
-      </w:pPr>
-    </w:p>
-    <w:p>
-      <w:pPr>
-        <w:jc w:val="both"/>
-        <w:rPr>
-          <w:lang w:val="es-CO"/>
-        </w:rPr>
-      </w:pPr>
-    </w:p>
-    <w:p>
-      <w:pPr>
-        <w:jc w:val="both"/>
-        <w:rPr>
-          <w:lang w:val="es-CO"/>
-        </w:rPr>
-      </w:pPr>
-    </w:p>
-    <w:p>
-      <w:pPr>
-        <w:jc w:val="both"/>
-        <w:rPr>
-          <w:lang w:val="es-CO"/>
-        </w:rPr>
-      </w:pPr>
-    </w:p>
-    <w:p>
-      <w:pPr>
-        <w:jc w:val="both"/>
-        <w:rPr>
-          <w:lang w:val="es-CO"/>
-        </w:rPr>
-      </w:pPr>
-    </w:p>
-    <w:p>
-      <w:pPr>
-        <w:jc w:val="both"/>
-        <w:rPr>
-          <w:lang w:val="es-CO"/>
-        </w:rPr>
-      </w:pPr>
-    </w:p>
-    <w:p>
-      <w:pPr>
-        <w:jc w:val="both"/>
-        <w:rPr>
-          <w:lang w:val="es-CO"/>
-        </w:rPr>
-      </w:pPr>
-    </w:p>
-    <w:p>
-      <w:pPr>
-        <w:jc w:val="both"/>
-        <w:rPr>
-          <w:lang w:val="es-CO"/>
-        </w:rPr>
-      </w:pPr>
-    </w:p>
-    <w:p>
-      <w:pPr>
-        <w:jc w:val="both"/>
-        <w:rPr>
-          <w:lang w:val="es-CO"/>
-        </w:rPr>
-      </w:pPr>
-    </w:p>
-    <w:p>
-      <w:pPr>
-        <w:jc w:val="both"/>
-        <w:rPr>
-          <w:lang w:val="es-CO"/>
-        </w:rPr>
-      </w:pPr>
-    </w:p>
-    <w:p>
-      <w:pPr>
-        <w:jc w:val="both"/>
-        <w:rPr>
-          <w:lang w:val="es-CO"/>
-        </w:rPr>
-      </w:pPr>
-    </w:p>
-    <w:p>
-      <w:pPr>
-        <w:jc w:val="both"/>
-        <w:rPr>
-          <w:lang w:val="es-CO"/>
-        </w:rPr>
-      </w:pPr>
-    </w:p>
-    <w:p>
-      <w:pPr>
-        <w:jc w:val="both"/>
-        <w:rPr>
-          <w:lang w:val="es-CO"/>
-        </w:rPr>
-      </w:pPr>
-    </w:p>
-    <w:p>
-      <w:pPr>
-        <w:jc w:val="both"/>
-        <w:rPr>
-          <w:lang w:val="es-CO"/>
-        </w:rPr>
-      </w:pPr>
-    </w:p>
-    <w:p>
-      <w:pPr>
-        <w:jc w:val="both"/>
-        <w:rPr>
-          <w:lang w:val="es-CO"/>
-        </w:rPr>
-      </w:pPr>
-    </w:p>
-    <w:p>
-      <w:pPr>
-        <w:jc w:val="both"/>
-        <w:rPr>
-          <w:lang w:val="es-CO"/>
-        </w:rPr>
-      </w:pPr>
-    </w:p>
-    <w:p>
-      <w:pPr>
-        <w:jc w:val="both"/>
-        <w:rPr>
-          <w:lang w:val="es-CO"/>
-        </w:rPr>
-      </w:pPr>
-    </w:p>
-    <w:p>
-      <w:pPr>
-        <w:jc w:val="both"/>
-        <w:rPr>
-          <w:lang w:val="es-CO"/>
-        </w:rPr>
-      </w:pPr>
-    </w:p>
-    <w:p>
-      <w:pPr>
-        <w:jc w:val="both"/>
-        <w:rPr>
-          <w:lang w:val="es-CO"/>
-        </w:rPr>
-      </w:pPr>
-    </w:p>
-    <w:p>
-      <w:pPr>
-        <w:jc w:val="both"/>
-        <w:rPr>
-          <w:lang w:val="es-CO"/>
-        </w:rPr>
-      </w:pPr>
-    </w:p>
-    <w:p>
-      <w:pPr>
-        <w:jc w:val="both"/>
-        <w:rPr>
-          <w:lang w:val="es-CO"/>
-        </w:rPr>
-      </w:pPr>
-    </w:p>
-    <w:p>
-      <w:pPr>
-        <w:jc w:val="both"/>
-        <w:rPr>
-          <w:lang w:val="es-CO"/>
-        </w:rPr>
-      </w:pPr>
-    </w:p>
-    <w:p>
-      <w:pPr>
-        <w:jc w:val="both"/>
-        <w:rPr>
-          <w:lang w:val="es-CO"/>
-        </w:rPr>
-      </w:pPr>
-    </w:p>
-    <w:p>
-      <w:pPr>
-        <w:jc w:val="center"/>
-        <w:rPr>
-          <w:lang w:val="es-CO"/>
-        </w:rPr>
-        <w:sectPr>
-          <w:type w:val="continuous"/>
-          <w:pgSz w:w="12240" w:h="15840"/>
-          <w:pgMar w:top="1440" w:right="1440" w:bottom="1440" w:left="1440" w:header="708" w:footer="708" w:gutter="0"/>
-          <w:cols w:num="2" w:space="708"/>
-          <w:docGrid w:linePitch="360"/>
-        </w:sectPr>
-      </w:pPr>
-    </w:p>
-    <w:p>
-      <w:pPr>
-        <w:jc w:val="center"/>
-        <w:rPr>
-          <w:lang w:val="es-CO"/>
-        </w:rPr>
-      </w:pPr>
-      <w:r>
-        <w:rPr>
-          <w:lang w:val="es-CO"/>
-        </w:rPr>
-        <w:lastRenderedPageBreak/>
-        <w:t>ACTIVIDAD S2 – ANÁLISIS DE PRINCIPIOS SOLID</w:t>
-      </w:r>
-    </w:p>
-    <w:p>
-      <w:pPr>
-        <w:jc w:val="center"/>
-        <w:rPr>
-          <w:lang w:val="es-CO"/>
-        </w:rPr>
-      </w:pPr>
-      <w:r>
-        <w:rPr>
-          <w:lang w:val="es-CO"/>
-        </w:rPr>
-        <w:t>Basado en los fragmentos del Taller S1</w:t>
-      </w:r>
-    </w:p>
-    <w:p>
-      <w:pPr>
-        <w:jc w:val="center"/>
-        <w:rPr>
-          <w:lang w:val="es-CO"/>
-        </w:rPr>
-      </w:pPr>
-    </w:p>
-    <w:p>
-      <w:pPr>
-        <w:jc w:val="center"/>
-        <w:rPr>
-          <w:lang w:val="es-CO"/>
-        </w:rPr>
-      </w:pPr>
-    </w:p>
-    <w:p>
-      <w:pPr>
-        <w:jc w:val="center"/>
-        <w:rPr>
-          <w:lang w:val="es-CO"/>
-        </w:rPr>
-      </w:pPr>
-    </w:p>
-    <w:p>
-      <w:pPr>
-        <w:jc w:val="center"/>
-        <w:rPr>
-          <w:lang w:val="es-CO"/>
-        </w:rPr>
-      </w:pPr>
-    </w:p>
-    <w:p>
-      <w:pPr>
-        <w:jc w:val="center"/>
-        <w:rPr>
-          <w:lang w:val="es-CO"/>
-        </w:rPr>
-      </w:pPr>
-      <w:r>
-        <w:rPr>
-          <w:lang w:val="es-CO"/>
-        </w:rPr>
-        <w:t>Nombres: Sebastian Rubiano Romero</w:t>
-      </w:r>
-    </w:p>
-    <w:p>
-      <w:pPr>
-        <w:jc w:val="center"/>
-        <w:rPr>
-          <w:lang w:val="es-CO"/>
-        </w:rPr>
-      </w:pPr>
-      <w:r>
-        <w:rPr>
-          <w:lang w:val="es-CO"/>
-        </w:rPr>
-        <w:t>Angie lucero Vargas Amado</w:t>
-      </w:r>
-    </w:p>
-    <w:p>
-      <w:pPr>
-        <w:jc w:val="center"/>
-        <w:rPr>
-          <w:lang w:val="es-CO"/>
-        </w:rPr>
-      </w:pPr>
-    </w:p>
-    <w:p>
-      <w:pPr>
-        <w:jc w:val="center"/>
-        <w:rPr>
-          <w:lang w:val="es-CO"/>
-        </w:rPr>
-      </w:pPr>
-    </w:p>
-    <w:p>
-      <w:pPr>
-        <w:jc w:val="center"/>
-        <w:rPr>
-          <w:lang w:val="es-CO"/>
-        </w:rPr>
-      </w:pPr>
-    </w:p>
-    <w:p>
-      <w:pPr>
-        <w:jc w:val="center"/>
-        <w:rPr>
-          <w:lang w:val="es-CO"/>
-        </w:rPr>
-      </w:pPr>
-    </w:p>
-    <w:p>
-      <w:pPr>
-        <w:jc w:val="center"/>
-        <w:rPr>
-          <w:lang w:val="es-CO"/>
-        </w:rPr>
-      </w:pPr>
-    </w:p>
-    <w:p>
-      <w:pPr>
-        <w:jc w:val="center"/>
-        <w:rPr>
-          <w:lang w:val="es-CO"/>
-        </w:rPr>
-      </w:pPr>
-      <w:r>
-        <w:rPr>
-          <w:lang w:val="es-CO"/>
-        </w:rPr>
-        <w:t>Docente Eliecer Montero</w:t>
-      </w:r>
-    </w:p>
-    <w:p>
-      <w:pPr>
-        <w:jc w:val="center"/>
-        <w:rPr>
-          <w:lang w:val="es-CO"/>
-        </w:rPr>
-      </w:pPr>
-      <w:r>
-        <w:rPr>
-          <w:lang w:val="es-CO"/>
-        </w:rPr>
-        <w:t>Grupo: E196</w:t>
-      </w:r>
-    </w:p>
-    <w:p>
-      <w:pPr>
-        <w:jc w:val="center"/>
-        <w:rPr>
-          <w:lang w:val="es-CO"/>
-        </w:rPr>
-      </w:pPr>
-    </w:p>
-    <w:p>
-      <w:pPr>
-        <w:jc w:val="center"/>
-        <w:rPr>
-          <w:lang w:val="es-CO"/>
-        </w:rPr>
-      </w:pPr>
-    </w:p>
-    <w:p>
-      <w:pPr>
-        <w:jc w:val="center"/>
-        <w:rPr>
-          <w:lang w:val="es-CO"/>
-        </w:rPr>
-      </w:pPr>
-    </w:p>
-    <w:p>
-      <w:pPr>
-        <w:jc w:val="center"/>
-        <w:rPr>
-          <w:lang w:val="es-CO"/>
-        </w:rPr>
-      </w:pPr>
-    </w:p>
-    <w:p>
-      <w:pPr>
-        <w:jc w:val="center"/>
-        <w:rPr>
-          <w:lang w:val="es-CO"/>
-        </w:rPr>
-      </w:pPr>
-    </w:p>
-    <w:p>
-      <w:pPr>
-        <w:jc w:val="center"/>
-        <w:rPr>
-          <w:lang w:val="es-CO"/>
-        </w:rPr>
-      </w:pPr>
-    </w:p>
-    <w:p>
-      <w:pPr>
-        <w:jc w:val="center"/>
-        <w:rPr>
-          <w:lang w:val="es-CO"/>
-        </w:rPr>
-      </w:pPr>
-    </w:p>
-    <w:p>
-      <w:pPr>
-        <w:jc w:val="center"/>
-        <w:rPr>
-          <w:lang w:val="es-CO"/>
-        </w:rPr>
-      </w:pPr>
-    </w:p>
-    <w:p>
-      <w:pPr>
-        <w:jc w:val="center"/>
-        <w:rPr>
-          <w:lang w:val="es-CO"/>
-        </w:rPr>
-      </w:pPr>
-    </w:p>
-    <w:p>
-      <w:pPr>
-        <w:jc w:val="center"/>
-        <w:rPr>
-          <w:lang w:val="es-CO"/>
-        </w:rPr>
-      </w:pPr>
-    </w:p>
-    <w:p>
-      <w:pPr>
-        <w:jc w:val="center"/>
-        <w:rPr>
-          <w:lang w:val="es-CO"/>
-        </w:rPr>
-      </w:pPr>
-      <w:r>
-        <w:rPr>
-          <w:lang w:val="es-CO"/>
-        </w:rPr>
-        <w:t>Fecha: 10/02/2026</w:t>
-      </w:r>
     </w:p>
     <w:p>
       <w:pPr>
@@ -2465,6 +1916,7 @@
   <w:style w:type="character" w:default="1" w:styleId="Fuentedeprrafopredeter">
     <w:name w:val="Default Paragraph Font"/>
     <w:uiPriority w:val="1"/>
+    <w:semiHidden/>
     <w:unhideWhenUsed/>
   </w:style>
   <w:style w:type="table" w:default="1" w:styleId="Tablanormal">

</xml_diff>

<commit_message>
Trabajo S5 ABSTRACT F
</commit_message>
<xml_diff>
--- a/Patrones/ACTIVIDAD_S5.docx
+++ b/Patrones/ACTIVIDAD_S5.docx
@@ -13,7 +13,35 @@
         <w:rPr>
           <w:lang w:val="es-CO"/>
         </w:rPr>
-        <w:t>ACTIVIDAD S5 – Patron Abstract Factory</w:t>
+        <w:t xml:space="preserve">ACTIVIDAD S5 – </w:t>
+      </w:r>
+      <w:proofErr w:type="spellStart"/>
+      <w:r>
+        <w:rPr>
+          <w:lang w:val="es-CO"/>
+        </w:rPr>
+        <w:t>Patron</w:t>
+      </w:r>
+      <w:proofErr w:type="spellEnd"/>
+      <w:r>
+        <w:rPr>
+          <w:lang w:val="es-CO"/>
+        </w:rPr>
+        <w:t xml:space="preserve"> </w:t>
+      </w:r>
+      <w:proofErr w:type="spellStart"/>
+      <w:r>
+        <w:rPr>
+          <w:lang w:val="es-CO"/>
+        </w:rPr>
+        <w:t>Abstract</w:t>
+      </w:r>
+      <w:proofErr w:type="spellEnd"/>
+      <w:r>
+        <w:rPr>
+          <w:lang w:val="es-CO"/>
+        </w:rPr>
+        <w:t xml:space="preserve"> Factory</w:t>
       </w:r>
     </w:p>
     <w:p>
@@ -45,8 +73,16 @@
         <w:rPr>
           <w:lang w:val="es-CO"/>
         </w:rPr>
-        <w:t xml:space="preserve"> Sistema de control de produccion</w:t>
-      </w:r>
+        <w:t xml:space="preserve"> Sistema de control de </w:t>
+      </w:r>
+      <w:proofErr w:type="spellStart"/>
+      <w:r>
+        <w:rPr>
+          <w:lang w:val="es-CO"/>
+        </w:rPr>
+        <w:t>produccion</w:t>
+      </w:r>
+      <w:proofErr w:type="spellEnd"/>
     </w:p>
     <w:p>
       <w:pPr>
@@ -368,119 +404,88 @@
           <w:lang w:val="es-CO"/>
         </w:rPr>
       </w:pPr>
-      <w:proofErr w:type="gramStart"/>
+      <w:proofErr w:type="spellStart"/>
       <w:r>
         <w:rPr>
           <w:b/>
           <w:lang w:val="es-CO"/>
         </w:rPr>
         <w:lastRenderedPageBreak/>
-        <w:t>Qué es Abstract Factory?</w:t>
-      </w:r>
-      <w:proofErr w:type="gramEnd"/>
-    </w:p>
-    <w:p>
-      <w:pPr>
-        <w:jc w:val="both"/>
-        <w:rPr>
-          <w:lang w:val="es-CO"/>
-        </w:rPr>
-      </w:pPr>
-      <w:r>
-        <w:rPr>
-          <w:lang w:val="es-CO"/>
-        </w:rPr>
-        <w:t>El patrón Abstract Factory permite crear familias de objetos relacionados sin especificar sus clases concretas.</w:t>
-      </w:r>
-    </w:p>
-    <w:p>
-      <w:pPr>
-        <w:jc w:val="both"/>
-        <w:rPr>
-          <w:lang w:val="es-CO"/>
-        </w:rPr>
-      </w:pPr>
-      <w:r>
-        <w:rPr>
-          <w:lang w:val="es-CO"/>
-        </w:rPr>
-        <w:t>Abstract Factory crea grupos de objetos que deben funcionar juntos.</w:t>
-      </w:r>
-    </w:p>
-    <w:p>
-      <w:pPr>
-        <w:jc w:val="both"/>
-        <w:rPr>
-          <w:lang w:val="es-CO"/>
-        </w:rPr>
-      </w:pPr>
-    </w:p>
-    <w:p>
-      <w:pPr>
-        <w:jc w:val="both"/>
-        <w:rPr>
-          <w:b/>
-          <w:lang w:val="es-CO"/>
-        </w:rPr>
-      </w:pPr>
-      <w:r>
-        <w:rPr>
-          <w:b/>
-          <w:lang w:val="es-CO"/>
-        </w:rPr>
-        <w:t>Uso:</w:t>
-      </w:r>
-    </w:p>
-    <w:p>
-      <w:pPr>
-        <w:jc w:val="both"/>
-        <w:rPr>
-          <w:lang w:val="es-CO"/>
-        </w:rPr>
-      </w:pPr>
-      <w:r>
-        <w:rPr>
-          <w:lang w:val="es-CO"/>
-        </w:rPr>
-        <w:t>Usé Abstract Factory para crear familias de objetos relacionados dentro del sistema de producción sin depender de sus clases concretas. Esto permite garantizar que los componentes creados sean compatibles entre sí.</w:t>
-      </w:r>
-    </w:p>
-    <w:p>
-      <w:pPr>
-        <w:jc w:val="both"/>
-        <w:rPr>
-          <w:lang w:val="es-CO"/>
-        </w:rPr>
-      </w:pPr>
-    </w:p>
-    <w:p>
-      <w:pPr>
-        <w:jc w:val="both"/>
-        <w:rPr>
-          <w:b/>
-          <w:lang w:val="es-CO"/>
-        </w:rPr>
-      </w:pPr>
-      <w:r>
-        <w:rPr>
-          <w:b/>
-          <w:lang w:val="es-CO"/>
-        </w:rPr>
-        <w:t>¿Qué problema resuelve?</w:t>
-      </w:r>
-    </w:p>
-    <w:p>
-      <w:pPr>
-        <w:jc w:val="both"/>
-        <w:rPr>
-          <w:lang w:val="es-CO"/>
-        </w:rPr>
-      </w:pPr>
-      <w:r>
-        <w:rPr>
-          <w:lang w:val="es-CO"/>
-        </w:rPr>
-        <w:t>Permite cambiar completamente una familia de objetos sin modificar el código cliente.</w:t>
+        <w:t>Abstract</w:t>
+      </w:r>
+      <w:proofErr w:type="spellEnd"/>
+      <w:r>
+        <w:rPr>
+          <w:b/>
+          <w:lang w:val="es-CO"/>
+        </w:rPr>
+        <w:t xml:space="preserve"> Factory</w:t>
+      </w:r>
+    </w:p>
+    <w:p>
+      <w:pPr>
+        <w:jc w:val="both"/>
+        <w:rPr>
+          <w:lang w:val="es-CO"/>
+        </w:rPr>
+      </w:pPr>
+      <w:r>
+        <w:rPr>
+          <w:lang w:val="es-CO"/>
+        </w:rPr>
+        <w:t xml:space="preserve">El patrón </w:t>
+      </w:r>
+      <w:proofErr w:type="spellStart"/>
+      <w:r>
+        <w:rPr>
+          <w:b/>
+          <w:bCs/>
+          <w:lang w:val="es-CO"/>
+        </w:rPr>
+        <w:t>Abstract</w:t>
+      </w:r>
+      <w:proofErr w:type="spellEnd"/>
+      <w:r>
+        <w:rPr>
+          <w:b/>
+          <w:bCs/>
+          <w:lang w:val="es-CO"/>
+        </w:rPr>
+        <w:t xml:space="preserve"> Factory</w:t>
+      </w:r>
+      <w:r>
+        <w:rPr>
+          <w:lang w:val="es-CO"/>
+        </w:rPr>
+        <w:t xml:space="preserve"> permite crear familias de objetos relacionados sin especificar sus clases concretas. En el contexto del sistema de control de producción (MES), este patrón se utiliza para representar diferentes configuraciones de líneas de producción, donde cada configuración requiere componentes compatibles entre sí.</w:t>
+      </w:r>
+    </w:p>
+    <w:p>
+      <w:pPr>
+        <w:jc w:val="both"/>
+        <w:rPr>
+          <w:lang w:val="es-CO"/>
+        </w:rPr>
+      </w:pPr>
+      <w:r>
+        <w:rPr>
+          <w:lang w:val="es-CO"/>
+        </w:rPr>
+        <w:t>En este caso se modelan dos tipos de líneas de producción: una línea automática y una línea manual. Cada una de estas líneas requiere un conjunto de componentes específicos, como máquinas y robots u operadores humanos. El patrón permite que el sistema cree estos componentes sin depender directamente de sus implementaciones concretas.</w:t>
+      </w:r>
+    </w:p>
+    <w:p>
+      <w:pPr>
+        <w:jc w:val="both"/>
+        <w:rPr>
+          <w:lang w:val="es-CO"/>
+        </w:rPr>
+      </w:pPr>
+      <w:r>
+        <w:rPr>
+          <w:lang w:val="es-CO"/>
+        </w:rPr>
+        <w:t>De esta forma, el controlador del sistema puede solicitar la creación de una línea de producción sin preocuparse por qué tipo específico de máquina o robot se utilizará, delegando esa responsabilidad a la fábrica correspondiente.</w:t>
       </w:r>
     </w:p>
     <w:p>
@@ -531,6 +536,7 @@
       </w:pPr>
       <w:r>
         <w:rPr>
+          <w:noProof/>
           <w:lang w:val="es-CO"/>
         </w:rPr>
         <w:drawing>
@@ -627,6 +633,46 @@
           <w:lang w:val="es-CO"/>
         </w:rPr>
       </w:pPr>
+    </w:p>
+    <w:p>
+      <w:pPr>
+        <w:jc w:val="both"/>
+        <w:rPr>
+          <w:b/>
+          <w:bCs/>
+          <w:lang w:val="es-CO"/>
+        </w:rPr>
+      </w:pPr>
+    </w:p>
+    <w:p>
+      <w:pPr>
+        <w:jc w:val="both"/>
+        <w:rPr>
+          <w:b/>
+          <w:bCs/>
+          <w:lang w:val="es-CO"/>
+        </w:rPr>
+      </w:pPr>
+    </w:p>
+    <w:p>
+      <w:pPr>
+        <w:jc w:val="both"/>
+        <w:rPr>
+          <w:b/>
+          <w:bCs/>
+          <w:lang w:val="es-CO"/>
+        </w:rPr>
+      </w:pPr>
+    </w:p>
+    <w:p>
+      <w:pPr>
+        <w:jc w:val="both"/>
+        <w:rPr>
+          <w:b/>
+          <w:bCs/>
+          <w:lang w:val="es-CO"/>
+        </w:rPr>
+      </w:pPr>
       <w:r>
         <w:rPr>
           <w:b/>
@@ -802,7 +848,25 @@
           <w:bCs/>
           <w:lang w:val="es-CO"/>
         </w:rPr>
-        <w:t>Estructura del patrón Abstract Factory</w:t>
+        <w:t xml:space="preserve">Estructura del patrón </w:t>
+      </w:r>
+      <w:proofErr w:type="spellStart"/>
+      <w:r>
+        <w:rPr>
+          <w:b/>
+          <w:bCs/>
+          <w:lang w:val="es-CO"/>
+        </w:rPr>
+        <w:t>Abstract</w:t>
+      </w:r>
+      <w:proofErr w:type="spellEnd"/>
+      <w:r>
+        <w:rPr>
+          <w:b/>
+          <w:bCs/>
+          <w:lang w:val="es-CO"/>
+        </w:rPr>
+        <w:t xml:space="preserve"> Factory</w:t>
       </w:r>
     </w:p>
     <w:p>
@@ -816,20 +880,38 @@
           <w:lang w:val="es-CO"/>
         </w:rPr>
       </w:pPr>
+      <w:proofErr w:type="spellStart"/>
       <w:r>
         <w:rPr>
           <w:b/>
           <w:bCs/>
           <w:lang w:val="es-CO"/>
         </w:rPr>
-        <w:t>AbstractFactory:</w:t>
-      </w:r>
-      <w:r>
-        <w:rPr>
-          <w:lang w:val="es-CO"/>
-        </w:rPr>
-        <w:t xml:space="preserve"> ProductionLineFactory</w:t>
-      </w:r>
+        <w:t>AbstractFactory</w:t>
+      </w:r>
+      <w:proofErr w:type="spellEnd"/>
+      <w:r>
+        <w:rPr>
+          <w:b/>
+          <w:bCs/>
+          <w:lang w:val="es-CO"/>
+        </w:rPr>
+        <w:t>:</w:t>
+      </w:r>
+      <w:r>
+        <w:rPr>
+          <w:lang w:val="es-CO"/>
+        </w:rPr>
+        <w:t xml:space="preserve"> </w:t>
+      </w:r>
+      <w:proofErr w:type="spellStart"/>
+      <w:r>
+        <w:rPr>
+          <w:lang w:val="es-CO"/>
+        </w:rPr>
+        <w:t>ProductionLineFactory</w:t>
+      </w:r>
+      <w:proofErr w:type="spellEnd"/>
     </w:p>
     <w:p>
       <w:pPr>
@@ -842,20 +924,52 @@
           <w:lang w:val="es-CO"/>
         </w:rPr>
       </w:pPr>
+      <w:proofErr w:type="spellStart"/>
       <w:r>
         <w:rPr>
           <w:b/>
           <w:bCs/>
           <w:lang w:val="es-CO"/>
         </w:rPr>
-        <w:t>ConcreteFactory:</w:t>
-      </w:r>
-      <w:r>
-        <w:rPr>
-          <w:lang w:val="es-CO"/>
-        </w:rPr>
-        <w:t xml:space="preserve"> AutomaticLineFactory, ManualLineFactory</w:t>
-      </w:r>
+        <w:t>ConcreteFactory</w:t>
+      </w:r>
+      <w:proofErr w:type="spellEnd"/>
+      <w:r>
+        <w:rPr>
+          <w:b/>
+          <w:bCs/>
+          <w:lang w:val="es-CO"/>
+        </w:rPr>
+        <w:t>:</w:t>
+      </w:r>
+      <w:r>
+        <w:rPr>
+          <w:lang w:val="es-CO"/>
+        </w:rPr>
+        <w:t xml:space="preserve"> </w:t>
+      </w:r>
+      <w:proofErr w:type="spellStart"/>
+      <w:r>
+        <w:rPr>
+          <w:lang w:val="es-CO"/>
+        </w:rPr>
+        <w:t>AutomaticLineFactory</w:t>
+      </w:r>
+      <w:proofErr w:type="spellEnd"/>
+      <w:r>
+        <w:rPr>
+          <w:lang w:val="es-CO"/>
+        </w:rPr>
+        <w:t xml:space="preserve">, </w:t>
+      </w:r>
+      <w:proofErr w:type="spellStart"/>
+      <w:r>
+        <w:rPr>
+          <w:lang w:val="es-CO"/>
+        </w:rPr>
+        <w:t>ManualLineFactory</w:t>
+      </w:r>
+      <w:proofErr w:type="spellEnd"/>
     </w:p>
     <w:p>
       <w:pPr>
@@ -868,13 +982,23 @@
           <w:lang w:val="es-CO"/>
         </w:rPr>
       </w:pPr>
+      <w:proofErr w:type="spellStart"/>
       <w:r>
         <w:rPr>
           <w:b/>
           <w:bCs/>
           <w:lang w:val="es-CO"/>
         </w:rPr>
-        <w:t>AbstractProducts:</w:t>
+        <w:t>AbstractProducts</w:t>
+      </w:r>
+      <w:proofErr w:type="spellEnd"/>
+      <w:r>
+        <w:rPr>
+          <w:b/>
+          <w:bCs/>
+          <w:lang w:val="es-CO"/>
+        </w:rPr>
+        <w:t>:</w:t>
       </w:r>
     </w:p>
     <w:p>
@@ -924,13 +1048,23 @@
           <w:lang w:val="es-CO"/>
         </w:rPr>
       </w:pPr>
+      <w:proofErr w:type="spellStart"/>
       <w:r>
         <w:rPr>
           <w:b/>
           <w:bCs/>
           <w:lang w:val="es-CO"/>
         </w:rPr>
-        <w:t>ConcreteProducts:</w:t>
+        <w:t>ConcreteProducts</w:t>
+      </w:r>
+      <w:proofErr w:type="spellEnd"/>
+      <w:r>
+        <w:rPr>
+          <w:b/>
+          <w:bCs/>
+          <w:lang w:val="es-CO"/>
+        </w:rPr>
+        <w:t>:</w:t>
       </w:r>
     </w:p>
     <w:p>
@@ -944,12 +1078,28 @@
           <w:lang w:val="es-CO"/>
         </w:rPr>
       </w:pPr>
-      <w:r>
-        <w:rPr>
-          <w:lang w:val="es-CO"/>
-        </w:rPr>
-        <w:t>CNCMachine, ManualMachine</w:t>
-      </w:r>
+      <w:proofErr w:type="spellStart"/>
+      <w:r>
+        <w:rPr>
+          <w:lang w:val="es-CO"/>
+        </w:rPr>
+        <w:t>CNCMachine</w:t>
+      </w:r>
+      <w:proofErr w:type="spellEnd"/>
+      <w:r>
+        <w:rPr>
+          <w:lang w:val="es-CO"/>
+        </w:rPr>
+        <w:t xml:space="preserve">, </w:t>
+      </w:r>
+      <w:proofErr w:type="spellStart"/>
+      <w:r>
+        <w:rPr>
+          <w:lang w:val="es-CO"/>
+        </w:rPr>
+        <w:t>ManualMachine</w:t>
+      </w:r>
+      <w:proofErr w:type="spellEnd"/>
     </w:p>
     <w:p>
       <w:pPr>
@@ -962,18 +1112,64 @@
           <w:lang w:val="es-CO"/>
         </w:rPr>
       </w:pPr>
-      <w:r>
-        <w:rPr>
-          <w:lang w:val="es-CO"/>
-        </w:rPr>
-        <w:t>IndustrialRobot, HumanOperator</w:t>
-      </w:r>
-    </w:p>
-    <w:p>
-      <w:pPr>
-        <w:jc w:val="both"/>
-        <w:rPr>
-          <w:lang w:val="es-CO"/>
+      <w:proofErr w:type="spellStart"/>
+      <w:r>
+        <w:rPr>
+          <w:lang w:val="es-CO"/>
+        </w:rPr>
+        <w:t>IndustrialRobot</w:t>
+      </w:r>
+      <w:proofErr w:type="spellEnd"/>
+      <w:r>
+        <w:rPr>
+          <w:lang w:val="es-CO"/>
+        </w:rPr>
+        <w:t xml:space="preserve">, </w:t>
+      </w:r>
+      <w:proofErr w:type="spellStart"/>
+      <w:r>
+        <w:rPr>
+          <w:lang w:val="es-CO"/>
+        </w:rPr>
+        <w:t>HumanOperator</w:t>
+      </w:r>
+      <w:proofErr w:type="spellEnd"/>
+    </w:p>
+    <w:p>
+      <w:pPr>
+        <w:jc w:val="both"/>
+        <w:rPr>
+          <w:noProof/>
+        </w:rPr>
+      </w:pPr>
+    </w:p>
+    <w:p>
+      <w:pPr>
+        <w:jc w:val="both"/>
+        <w:rPr>
+          <w:noProof/>
+        </w:rPr>
+      </w:pPr>
+      <w:r>
+        <w:rPr>
+          <w:noProof/>
+        </w:rPr>
+        <w:t>Cada fábrica concreta crea una familia de productos compatibles que representan una configuración específica de la línea de producción.</w:t>
+      </w:r>
+    </w:p>
+    <w:p>
+      <w:pPr>
+        <w:jc w:val="both"/>
+        <w:rPr>
+          <w:noProof/>
+        </w:rPr>
+      </w:pPr>
+    </w:p>
+    <w:p>
+      <w:pPr>
+        <w:jc w:val="both"/>
+        <w:rPr>
+          <w:noProof/>
         </w:rPr>
       </w:pPr>
     </w:p>
@@ -1110,9 +1306,110 @@
       <w:pPr>
         <w:jc w:val="both"/>
         <w:rPr>
-          <w:lang w:val="es-CO"/>
-        </w:rPr>
-      </w:pPr>
+          <w:b/>
+          <w:lang w:val="es-CO"/>
+        </w:rPr>
+      </w:pPr>
+      <w:r>
+        <w:rPr>
+          <w:b/>
+          <w:lang w:val="es-CO"/>
+        </w:rPr>
+        <w:lastRenderedPageBreak/>
+        <w:t xml:space="preserve">El patrón </w:t>
+      </w:r>
+      <w:proofErr w:type="spellStart"/>
+      <w:r>
+        <w:rPr>
+          <w:b/>
+          <w:lang w:val="es-CO"/>
+        </w:rPr>
+        <w:t>Abstract</w:t>
+      </w:r>
+      <w:proofErr w:type="spellEnd"/>
+      <w:r>
+        <w:rPr>
+          <w:b/>
+          <w:lang w:val="es-CO"/>
+        </w:rPr>
+        <w:t xml:space="preserve"> Factory:</w:t>
+      </w:r>
+    </w:p>
+    <w:p>
+      <w:pPr>
+        <w:pStyle w:val="Prrafodelista"/>
+        <w:numPr>
+          <w:ilvl w:val="0"/>
+          <w:numId w:val="4"/>
+        </w:numPr>
+        <w:jc w:val="both"/>
+        <w:rPr>
+          <w:lang w:val="es-CO"/>
+        </w:rPr>
+      </w:pPr>
+      <w:r>
+        <w:rPr>
+          <w:lang w:val="es-CO"/>
+        </w:rPr>
+        <w:t>Permite crear familias de objetos relacionados sin depender de implementaciones concretas.</w:t>
+      </w:r>
+    </w:p>
+    <w:p>
+      <w:pPr>
+        <w:pStyle w:val="Prrafodelista"/>
+        <w:numPr>
+          <w:ilvl w:val="0"/>
+          <w:numId w:val="4"/>
+        </w:numPr>
+        <w:jc w:val="both"/>
+        <w:rPr>
+          <w:lang w:val="es-CO"/>
+        </w:rPr>
+      </w:pPr>
+      <w:r>
+        <w:rPr>
+          <w:lang w:val="es-CO"/>
+        </w:rPr>
+        <w:t>Garantiza que los componentes creados sean compatibles entre sí.</w:t>
+      </w:r>
+    </w:p>
+    <w:p>
+      <w:pPr>
+        <w:pStyle w:val="Prrafodelista"/>
+        <w:numPr>
+          <w:ilvl w:val="0"/>
+          <w:numId w:val="4"/>
+        </w:numPr>
+        <w:jc w:val="both"/>
+        <w:rPr>
+          <w:lang w:val="es-CO"/>
+        </w:rPr>
+      </w:pPr>
+      <w:r>
+        <w:rPr>
+          <w:lang w:val="es-CO"/>
+        </w:rPr>
+        <w:t>Reduce el acoplamiento entre el cliente y las clases concretas.</w:t>
+      </w:r>
+    </w:p>
+    <w:p>
+      <w:pPr>
+        <w:pStyle w:val="Prrafodelista"/>
+        <w:numPr>
+          <w:ilvl w:val="0"/>
+          <w:numId w:val="4"/>
+        </w:numPr>
+        <w:jc w:val="both"/>
+        <w:rPr>
+          <w:lang w:val="es-CO"/>
+        </w:rPr>
+      </w:pPr>
+      <w:r>
+        <w:rPr>
+          <w:lang w:val="es-CO"/>
+        </w:rPr>
+        <w:t>Facilita la extensión del sistema al permitir agregar nuevas configuraciones de producción sin modificar el código existente.</w:t>
+      </w:r>
     </w:p>
     <w:sectPr>
       <w:type w:val="continuous"/>
@@ -1502,6 +1799,119 @@
       </w:rPr>
     </w:lvl>
   </w:abstractNum>
+  <w:abstractNum w:abstractNumId="3" w15:restartNumberingAfterBreak="0">
+    <w:nsid w:val="48AE6F84"/>
+    <w:multiLevelType w:val="hybridMultilevel"/>
+    <w:tmpl w:val="D714D81C"/>
+    <w:lvl w:ilvl="0" w:tplc="04090001">
+      <w:start w:val="1"/>
+      <w:numFmt w:val="bullet"/>
+      <w:lvlText w:val=""/>
+      <w:lvlJc w:val="left"/>
+      <w:pPr>
+        <w:ind w:left="720" w:hanging="360"/>
+      </w:pPr>
+      <w:rPr>
+        <w:rFonts w:ascii="Symbol" w:hAnsi="Symbol" w:hint="default"/>
+      </w:rPr>
+    </w:lvl>
+    <w:lvl w:ilvl="1" w:tplc="04090003" w:tentative="1">
+      <w:start w:val="1"/>
+      <w:numFmt w:val="bullet"/>
+      <w:lvlText w:val="o"/>
+      <w:lvlJc w:val="left"/>
+      <w:pPr>
+        <w:ind w:left="1440" w:hanging="360"/>
+      </w:pPr>
+      <w:rPr>
+        <w:rFonts w:ascii="Courier New" w:hAnsi="Courier New" w:cs="Courier New" w:hint="default"/>
+      </w:rPr>
+    </w:lvl>
+    <w:lvl w:ilvl="2" w:tplc="04090005" w:tentative="1">
+      <w:start w:val="1"/>
+      <w:numFmt w:val="bullet"/>
+      <w:lvlText w:val=""/>
+      <w:lvlJc w:val="left"/>
+      <w:pPr>
+        <w:ind w:left="2160" w:hanging="360"/>
+      </w:pPr>
+      <w:rPr>
+        <w:rFonts w:ascii="Wingdings" w:hAnsi="Wingdings" w:hint="default"/>
+      </w:rPr>
+    </w:lvl>
+    <w:lvl w:ilvl="3" w:tplc="04090001" w:tentative="1">
+      <w:start w:val="1"/>
+      <w:numFmt w:val="bullet"/>
+      <w:lvlText w:val=""/>
+      <w:lvlJc w:val="left"/>
+      <w:pPr>
+        <w:ind w:left="2880" w:hanging="360"/>
+      </w:pPr>
+      <w:rPr>
+        <w:rFonts w:ascii="Symbol" w:hAnsi="Symbol" w:hint="default"/>
+      </w:rPr>
+    </w:lvl>
+    <w:lvl w:ilvl="4" w:tplc="04090003" w:tentative="1">
+      <w:start w:val="1"/>
+      <w:numFmt w:val="bullet"/>
+      <w:lvlText w:val="o"/>
+      <w:lvlJc w:val="left"/>
+      <w:pPr>
+        <w:ind w:left="3600" w:hanging="360"/>
+      </w:pPr>
+      <w:rPr>
+        <w:rFonts w:ascii="Courier New" w:hAnsi="Courier New" w:cs="Courier New" w:hint="default"/>
+      </w:rPr>
+    </w:lvl>
+    <w:lvl w:ilvl="5" w:tplc="04090005" w:tentative="1">
+      <w:start w:val="1"/>
+      <w:numFmt w:val="bullet"/>
+      <w:lvlText w:val=""/>
+      <w:lvlJc w:val="left"/>
+      <w:pPr>
+        <w:ind w:left="4320" w:hanging="360"/>
+      </w:pPr>
+      <w:rPr>
+        <w:rFonts w:ascii="Wingdings" w:hAnsi="Wingdings" w:hint="default"/>
+      </w:rPr>
+    </w:lvl>
+    <w:lvl w:ilvl="6" w:tplc="04090001" w:tentative="1">
+      <w:start w:val="1"/>
+      <w:numFmt w:val="bullet"/>
+      <w:lvlText w:val=""/>
+      <w:lvlJc w:val="left"/>
+      <w:pPr>
+        <w:ind w:left="5040" w:hanging="360"/>
+      </w:pPr>
+      <w:rPr>
+        <w:rFonts w:ascii="Symbol" w:hAnsi="Symbol" w:hint="default"/>
+      </w:rPr>
+    </w:lvl>
+    <w:lvl w:ilvl="7" w:tplc="04090003" w:tentative="1">
+      <w:start w:val="1"/>
+      <w:numFmt w:val="bullet"/>
+      <w:lvlText w:val="o"/>
+      <w:lvlJc w:val="left"/>
+      <w:pPr>
+        <w:ind w:left="5760" w:hanging="360"/>
+      </w:pPr>
+      <w:rPr>
+        <w:rFonts w:ascii="Courier New" w:hAnsi="Courier New" w:cs="Courier New" w:hint="default"/>
+      </w:rPr>
+    </w:lvl>
+    <w:lvl w:ilvl="8" w:tplc="04090005" w:tentative="1">
+      <w:start w:val="1"/>
+      <w:numFmt w:val="bullet"/>
+      <w:lvlText w:val=""/>
+      <w:lvlJc w:val="left"/>
+      <w:pPr>
+        <w:ind w:left="6480" w:hanging="360"/>
+      </w:pPr>
+      <w:rPr>
+        <w:rFonts w:ascii="Wingdings" w:hAnsi="Wingdings" w:hint="default"/>
+      </w:rPr>
+    </w:lvl>
+  </w:abstractNum>
   <w:num w:numId="1">
     <w:abstractNumId w:val="0"/>
   </w:num>
@@ -1510,6 +1920,9 @@
   </w:num>
   <w:num w:numId="3">
     <w:abstractNumId w:val="1"/>
+  </w:num>
+  <w:num w:numId="4">
+    <w:abstractNumId w:val="3"/>
   </w:num>
 </w:numbering>
 </file>
@@ -1916,7 +2329,6 @@
   <w:style w:type="character" w:default="1" w:styleId="Fuentedeprrafopredeter">
     <w:name w:val="Default Paragraph Font"/>
     <w:uiPriority w:val="1"/>
-    <w:semiHidden/>
     <w:unhideWhenUsed/>
   </w:style>
   <w:style w:type="table" w:default="1" w:styleId="Tablanormal">

</xml_diff>